<commit_message>
feat: v2 - Fix hierarchy + Redesign Mini App + SGN Jondo
</commit_message>
<xml_diff>
--- a/mong muốn 1.docx
+++ b/mong muốn 1.docx
@@ -991,6 +991,30 @@
                 <w:lang w:val="vi-VN"/>
               </w:rPr>
             </w:pPr>
+            <w:r>
+              <w:rPr>
+                <w:lang w:val="vi-VN"/>
+              </w:rPr>
+              <w:t xml:space="preserve">Điều chỉnh </w:t>
+            </w:r>
+            <w:r>
+              <w:rPr>
+                <w:lang w:val="vi-VN"/>
+              </w:rPr>
+              <w:t xml:space="preserve">nhân sự </w:t>
+            </w:r>
+            <w:r>
+              <w:rPr>
+                <w:lang w:val="vi-VN"/>
+              </w:rPr>
+              <w:t>ở</w:t>
+            </w:r>
+            <w:r>
+              <w:rPr>
+                <w:lang w:val="vi-VN"/>
+              </w:rPr>
+              <w:t xml:space="preserve"> Tổ</w:t>
+            </w:r>
           </w:p>
         </w:tc>
         <w:tc>
@@ -1003,6 +1027,12 @@
                 <w:lang w:val="vi-VN"/>
               </w:rPr>
             </w:pPr>
+            <w:r>
+              <w:rPr>
+                <w:lang w:val="vi-VN"/>
+              </w:rPr>
+              <w:t>YJYN, TJN, GYJN</w:t>
+            </w:r>
           </w:p>
         </w:tc>
         <w:tc>
@@ -1015,6 +1045,68 @@
                 <w:lang w:val="vi-VN"/>
               </w:rPr>
             </w:pPr>
+            <w:r>
+              <w:rPr>
+                <w:lang w:val="vi-VN"/>
+              </w:rPr>
+              <w:t xml:space="preserve">Thêm 1 người có trong danh sách </w:t>
+            </w:r>
+            <w:r>
+              <w:rPr>
+                <w:lang w:val="vi-VN"/>
+              </w:rPr>
+              <w:t xml:space="preserve">nhân sự vào 1 tổ xác định, ví dụ HCM2-N1T1 là 1 tổ (HCM là </w:t>
+            </w:r>
+            <w:r>
+              <w:rPr>
+                <w:lang w:val="vi-VN"/>
+              </w:rPr>
+              <w:lastRenderedPageBreak/>
+              <w:t>khu vực, HCM2 là khu vực HCM số 2, N1 là nhóm1 , T1 là Tổ 1, HCM2-N1T1 là</w:t>
+            </w:r>
+            <w:r>
+              <w:rPr>
+                <w:lang w:val="vi-VN"/>
+              </w:rPr>
+              <w:t xml:space="preserve"> Tổ 1 Nhóm 1 khu vực HCM2</w:t>
+            </w:r>
+            <w:r>
+              <w:rPr>
+                <w:lang w:val="vi-VN"/>
+              </w:rPr>
+              <w:t xml:space="preserve"> </w:t>
+            </w:r>
+            <w:r>
+              <w:rPr>
+                <w:lang w:val="vi-VN"/>
+              </w:rPr>
+              <w:br/>
+            </w:r>
+            <w:r>
+              <w:rPr>
+                <w:lang w:val="vi-VN"/>
+              </w:rPr>
+              <w:t>1 người chỉ có ở trong 1 Tổ cùng 1 lúc</w:t>
+            </w:r>
+            <w:r>
+              <w:rPr>
+                <w:lang w:val="vi-VN"/>
+              </w:rPr>
+              <w:br/>
+              <w:t>1 Tổ có thể chứa được tất cả các Chức vụ từ YJN</w:t>
+            </w:r>
+            <w:r>
+              <w:rPr>
+                <w:lang w:val="vi-VN"/>
+              </w:rPr>
+              <w:t>, TJN, GGN Jondo và GGN Chakki, SGN Jondo (đổi tên từ Thư kí Jondo)</w:t>
+            </w:r>
+            <w:r>
+              <w:rPr>
+                <w:lang w:val="vi-VN"/>
+              </w:rPr>
+              <w:t>, vừa là cấp quản lý những thuộc về 1 Tổ nào đó, không bị xung đột quyền hạn vs GYJN hay BGYJN là Tổ trưởng và Tổ phó trong Tổ đó</w:t>
+            </w:r>
           </w:p>
         </w:tc>
         <w:tc>
@@ -1027,6 +1119,13 @@
                 <w:lang w:val="vi-VN"/>
               </w:rPr>
             </w:pPr>
+            <w:r>
+              <w:rPr>
+                <w:lang w:val="vi-VN"/>
+              </w:rPr>
+              <w:lastRenderedPageBreak/>
+              <w:t>Cá nhân</w:t>
+            </w:r>
           </w:p>
         </w:tc>
       </w:tr>

</xml_diff>

<commit_message>
feat(mini-app): update TV/BB report forms to official template fields
</commit_message>
<xml_diff>
--- a/mong muốn 1.docx
+++ b/mong muốn 1.docx
@@ -196,14 +196,24 @@
       <w:r>
         <w:t xml:space="preserve">Hình </w:t>
       </w:r>
-      <w:fldSimple w:instr=" SEQ Hình \* ARABIC ">
-        <w:r>
-          <w:rPr>
-            <w:noProof/>
-          </w:rPr>
-          <w:t>1</w:t>
-        </w:r>
-      </w:fldSimple>
+      <w:r>
+        <w:fldChar w:fldCharType="begin"/>
+      </w:r>
+      <w:r>
+        <w:instrText xml:space="preserve"> SEQ Hình \* ARABIC </w:instrText>
+      </w:r>
+      <w:r>
+        <w:fldChar w:fldCharType="separate"/>
+      </w:r>
+      <w:r>
+        <w:rPr>
+          <w:noProof/>
+        </w:rPr>
+        <w:t>1</w:t>
+      </w:r>
+      <w:r>
+        <w:fldChar w:fldCharType="end"/>
+      </w:r>
       <w:r>
         <w:rPr>
           <w:lang w:val="vi-VN"/>
@@ -1201,14 +1211,24 @@
       <w:r>
         <w:t xml:space="preserve">Hình </w:t>
       </w:r>
-      <w:fldSimple w:instr=" SEQ Hình \* ARABIC ">
-        <w:r>
-          <w:rPr>
-            <w:noProof/>
-          </w:rPr>
-          <w:t>2</w:t>
-        </w:r>
-      </w:fldSimple>
+      <w:r>
+        <w:fldChar w:fldCharType="begin"/>
+      </w:r>
+      <w:r>
+        <w:instrText xml:space="preserve"> SEQ Hình \* ARABIC </w:instrText>
+      </w:r>
+      <w:r>
+        <w:fldChar w:fldCharType="separate"/>
+      </w:r>
+      <w:r>
+        <w:rPr>
+          <w:noProof/>
+        </w:rPr>
+        <w:t>2</w:t>
+      </w:r>
+      <w:r>
+        <w:fldChar w:fldCharType="end"/>
+      </w:r>
       <w:r>
         <w:rPr>
           <w:lang w:val="vi-VN"/>
@@ -1285,14 +1305,24 @@
         <w:lastRenderedPageBreak/>
         <w:t xml:space="preserve">Bảng </w:t>
       </w:r>
-      <w:fldSimple w:instr=" SEQ Bảng \* ARABIC ">
-        <w:r>
-          <w:rPr>
-            <w:noProof/>
-          </w:rPr>
-          <w:t>1</w:t>
-        </w:r>
-      </w:fldSimple>
+      <w:r>
+        <w:fldChar w:fldCharType="begin"/>
+      </w:r>
+      <w:r>
+        <w:instrText xml:space="preserve"> SEQ Bảng \* ARABIC </w:instrText>
+      </w:r>
+      <w:r>
+        <w:fldChar w:fldCharType="separate"/>
+      </w:r>
+      <w:r>
+        <w:rPr>
+          <w:noProof/>
+        </w:rPr>
+        <w:t>1</w:t>
+      </w:r>
+      <w:r>
+        <w:fldChar w:fldCharType="end"/>
+      </w:r>
       <w:r>
         <w:rPr>
           <w:lang w:val="vi-VN"/>
@@ -1377,17 +1407,26 @@
         <w:keepNext/>
       </w:pPr>
       <w:r>
-        <w:lastRenderedPageBreak/>
         <w:t xml:space="preserve">Bảng </w:t>
       </w:r>
-      <w:fldSimple w:instr=" SEQ Bảng \* ARABIC ">
-        <w:r>
-          <w:rPr>
-            <w:noProof/>
-          </w:rPr>
-          <w:t>2</w:t>
-        </w:r>
-      </w:fldSimple>
+      <w:r>
+        <w:fldChar w:fldCharType="begin"/>
+      </w:r>
+      <w:r>
+        <w:instrText xml:space="preserve"> SEQ Bảng \* ARABIC </w:instrText>
+      </w:r>
+      <w:r>
+        <w:fldChar w:fldCharType="separate"/>
+      </w:r>
+      <w:r>
+        <w:rPr>
+          <w:noProof/>
+        </w:rPr>
+        <w:t>2</w:t>
+      </w:r>
+      <w:r>
+        <w:fldChar w:fldCharType="end"/>
+      </w:r>
       <w:r>
         <w:rPr>
           <w:lang w:val="vi-VN"/>
@@ -1398,48 +1437,121 @@
     <w:p>
       <w:pPr>
         <w:rPr>
+          <w:b/>
+          <w:bCs/>
           <w:lang w:val="vi-VN"/>
         </w:rPr>
       </w:pPr>
       <w:r>
         <w:rPr>
+          <w:b/>
+          <w:bCs/>
           <w:lang w:val="vi-VN"/>
         </w:rPr>
-        <w:drawing>
-          <wp:inline distT="0" distB="0" distL="0" distR="0" wp14:anchorId="0F732DCA" wp14:editId="50B050F5">
-            <wp:extent cx="5572903" cy="2943636"/>
-            <wp:effectExtent l="0" t="0" r="8890" b="9525"/>
-            <wp:docPr id="116325528" name="Picture 1"/>
-            <wp:cNvGraphicFramePr>
-              <a:graphicFrameLocks xmlns:a="http://schemas.openxmlformats.org/drawingml/2006/main" noChangeAspect="1"/>
-            </wp:cNvGraphicFramePr>
-            <a:graphic xmlns:a="http://schemas.openxmlformats.org/drawingml/2006/main">
-              <a:graphicData uri="http://schemas.openxmlformats.org/drawingml/2006/picture">
-                <pic:pic xmlns:pic="http://schemas.openxmlformats.org/drawingml/2006/picture">
-                  <pic:nvPicPr>
-                    <pic:cNvPr id="116325528" name=""/>
-                    <pic:cNvPicPr/>
-                  </pic:nvPicPr>
-                  <pic:blipFill>
-                    <a:blip r:embed="rId12"/>
-                    <a:stretch>
-                      <a:fillRect/>
-                    </a:stretch>
-                  </pic:blipFill>
-                  <pic:spPr>
-                    <a:xfrm>
-                      <a:off x="0" y="0"/>
-                      <a:ext cx="5572903" cy="2943636"/>
-                    </a:xfrm>
-                    <a:prstGeom prst="rect">
-                      <a:avLst/>
-                    </a:prstGeom>
-                  </pic:spPr>
-                </pic:pic>
-              </a:graphicData>
-            </a:graphic>
-          </wp:inline>
-        </w:drawing>
+        <w:t xml:space="preserve">BÁO CÁO </w:t>
+      </w:r>
+      <w:r>
+        <w:rPr>
+          <w:b/>
+          <w:bCs/>
+        </w:rPr>
+        <w:t>TƯ VẤN </w:t>
+      </w:r>
+    </w:p>
+    <w:p>
+      <w:pPr>
+        <w:numPr>
+          <w:ilvl w:val="0"/>
+          <w:numId w:val="6"/>
+        </w:numPr>
+      </w:pPr>
+      <w:r>
+        <w:rPr>
+          <w:lang w:val="vi-VN"/>
+        </w:rPr>
+        <w:t>Lần thứ:</w:t>
+      </w:r>
+    </w:p>
+    <w:p>
+      <w:pPr>
+        <w:numPr>
+          <w:ilvl w:val="0"/>
+          <w:numId w:val="6"/>
+        </w:numPr>
+      </w:pPr>
+      <w:r>
+        <w:t>Tên công cụ tư vấn</w:t>
+      </w:r>
+    </w:p>
+    <w:p>
+      <w:pPr>
+        <w:numPr>
+          <w:ilvl w:val="0"/>
+          <w:numId w:val="6"/>
+        </w:numPr>
+      </w:pPr>
+      <w:r>
+        <w:t>Kết quả test công cụ</w:t>
+      </w:r>
+    </w:p>
+    <w:p>
+      <w:pPr>
+        <w:numPr>
+          <w:ilvl w:val="0"/>
+          <w:numId w:val="6"/>
+        </w:numPr>
+      </w:pPr>
+      <w:r>
+        <w:rPr>
+          <w:lang w:val="vi-VN"/>
+        </w:rPr>
+        <w:t>V</w:t>
+      </w:r>
+      <w:r>
+        <w:t>ấn đề/nhu cầu/thông tin khai thác được</w:t>
+      </w:r>
+    </w:p>
+    <w:p>
+      <w:pPr>
+        <w:numPr>
+          <w:ilvl w:val="0"/>
+          <w:numId w:val="6"/>
+        </w:numPr>
+      </w:pPr>
+      <w:r>
+        <w:t>Phản hồi/Cảm nhận của trái sau tư vấn: </w:t>
+      </w:r>
+    </w:p>
+    <w:p>
+      <w:pPr>
+        <w:numPr>
+          <w:ilvl w:val="0"/>
+          <w:numId w:val="6"/>
+        </w:numPr>
+      </w:pPr>
+      <w:r>
+        <w:rPr>
+          <w:lang w:val="vi-VN"/>
+        </w:rPr>
+        <w:t>Điểm hái trái</w:t>
+      </w:r>
+    </w:p>
+    <w:p>
+      <w:pPr>
+        <w:numPr>
+          <w:ilvl w:val="0"/>
+          <w:numId w:val="6"/>
+        </w:numPr>
+      </w:pPr>
+      <w:r>
+        <w:lastRenderedPageBreak/>
+        <w:t xml:space="preserve">Đề xuất </w:t>
+      </w:r>
+      <w:r>
+        <w:rPr>
+          <w:lang w:val="vi-VN"/>
+        </w:rPr>
+        <w:t>của TVV</w:t>
       </w:r>
     </w:p>
     <w:p>
@@ -1449,9 +1561,7 @@
           <w:ilvl w:val="0"/>
           <w:numId w:val="1"/>
         </w:numPr>
-        <w:rPr>
-          <w:lang w:val="vi-VN"/>
-        </w:rPr>
+        <w:ind w:firstLine="720"/>
       </w:pPr>
       <w:r>
         <w:rPr>
@@ -1475,54 +1585,6 @@
       </w:r>
       <w:r>
         <w:rPr>
-          <w:lang w:val="vi-VN"/>
-        </w:rPr>
-        <w:drawing>
-          <wp:inline distT="0" distB="0" distL="0" distR="0" wp14:anchorId="3F54BA07" wp14:editId="30717F80">
-            <wp:extent cx="5534797" cy="3162741"/>
-            <wp:effectExtent l="0" t="0" r="8890" b="0"/>
-            <wp:docPr id="312970368" name="Picture 1"/>
-            <wp:cNvGraphicFramePr>
-              <a:graphicFrameLocks xmlns:a="http://schemas.openxmlformats.org/drawingml/2006/main" noChangeAspect="1"/>
-            </wp:cNvGraphicFramePr>
-            <a:graphic xmlns:a="http://schemas.openxmlformats.org/drawingml/2006/main">
-              <a:graphicData uri="http://schemas.openxmlformats.org/drawingml/2006/picture">
-                <pic:pic xmlns:pic="http://schemas.openxmlformats.org/drawingml/2006/picture">
-                  <pic:nvPicPr>
-                    <pic:cNvPr id="312970368" name=""/>
-                    <pic:cNvPicPr/>
-                  </pic:nvPicPr>
-                  <pic:blipFill>
-                    <a:blip r:embed="rId13"/>
-                    <a:stretch>
-                      <a:fillRect/>
-                    </a:stretch>
-                  </pic:blipFill>
-                  <pic:spPr>
-                    <a:xfrm>
-                      <a:off x="0" y="0"/>
-                      <a:ext cx="5534797" cy="3162741"/>
-                    </a:xfrm>
-                    <a:prstGeom prst="rect">
-                      <a:avLst/>
-                    </a:prstGeom>
-                  </pic:spPr>
-                </pic:pic>
-              </a:graphicData>
-            </a:graphic>
-          </wp:inline>
-        </w:drawing>
-      </w:r>
-    </w:p>
-    <w:p>
-      <w:pPr>
-        <w:ind w:firstLine="720"/>
-        <w:rPr>
-          <w:lang w:val="vi-VN"/>
-        </w:rPr>
-      </w:pPr>
-      <w:r>
-        <w:rPr>
           <w:b/>
           <w:bCs/>
           <w:lang w:val="vi-VN"/>
@@ -1535,6 +1597,203 @@
         </w:rPr>
         <w:t xml:space="preserve">        </w:t>
       </w:r>
+      <w:r>
+        <w:rPr>
+          <w:lang w:val="vi-VN"/>
+        </w:rPr>
+        <w:br/>
+      </w:r>
+      <w:r>
+        <w:rPr>
+          <w:b/>
+          <w:bCs/>
+          <w:lang w:val="vi-VN"/>
+        </w:rPr>
+        <w:t xml:space="preserve">BÁO CÁO </w:t>
+      </w:r>
+      <w:r>
+        <w:rPr>
+          <w:b/>
+          <w:bCs/>
+        </w:rPr>
+        <w:t>BB </w:t>
+      </w:r>
+    </w:p>
+    <w:p>
+      <w:pPr>
+        <w:pStyle w:val="ListParagraph"/>
+        <w:numPr>
+          <w:ilvl w:val="0"/>
+          <w:numId w:val="1"/>
+        </w:numPr>
+        <w:ind w:firstLine="720"/>
+      </w:pPr>
+      <w:r>
+        <w:rPr>
+          <w:lang w:val="vi-VN"/>
+        </w:rPr>
+        <w:t xml:space="preserve">Buổi thứ: </w:t>
+      </w:r>
+    </w:p>
+    <w:p>
+      <w:pPr>
+        <w:pStyle w:val="ListParagraph"/>
+        <w:numPr>
+          <w:ilvl w:val="0"/>
+          <w:numId w:val="1"/>
+        </w:numPr>
+        <w:ind w:firstLine="720"/>
+      </w:pPr>
+      <w:r>
+        <w:rPr>
+          <w:lang w:val="vi-VN"/>
+        </w:rPr>
+        <w:t>Nội dung buổi học</w:t>
+      </w:r>
+    </w:p>
+    <w:p>
+      <w:pPr>
+        <w:pStyle w:val="ListParagraph"/>
+        <w:numPr>
+          <w:ilvl w:val="0"/>
+          <w:numId w:val="1"/>
+        </w:numPr>
+        <w:ind w:firstLine="720"/>
+      </w:pPr>
+      <w:r>
+        <w:t xml:space="preserve">Phản </w:t>
+      </w:r>
+      <w:r>
+        <w:rPr>
+          <w:lang w:val="vi-VN"/>
+        </w:rPr>
+        <w:t xml:space="preserve">ứng </w:t>
+      </w:r>
+      <w:r>
+        <w:t>của HS trong và sau buổi học </w:t>
+      </w:r>
+    </w:p>
+    <w:p>
+      <w:pPr>
+        <w:pStyle w:val="ListParagraph"/>
+        <w:numPr>
+          <w:ilvl w:val="0"/>
+          <w:numId w:val="1"/>
+        </w:numPr>
+        <w:ind w:firstLine="720"/>
+      </w:pPr>
+      <w:r>
+        <w:rPr>
+          <w:lang w:val="vi-VN"/>
+        </w:rPr>
+        <w:t>Khai thác mới về HS</w:t>
+      </w:r>
+    </w:p>
+    <w:p>
+      <w:pPr>
+        <w:pStyle w:val="ListParagraph"/>
+        <w:numPr>
+          <w:ilvl w:val="0"/>
+          <w:numId w:val="1"/>
+        </w:numPr>
+        <w:ind w:firstLine="720"/>
+      </w:pPr>
+      <w:r>
+        <w:rPr>
+          <w:lang w:val="vi-VN"/>
+        </w:rPr>
+        <w:t>T</w:t>
+      </w:r>
+      <w:r>
+        <w:rPr>
+          <w:lang w:val="vi-VN"/>
+        </w:rPr>
+        <w:t xml:space="preserve">ương tác </w:t>
+      </w:r>
+      <w:r>
+        <w:rPr>
+          <w:lang w:val="vi-VN"/>
+        </w:rPr>
+        <w:t xml:space="preserve">với HS </w:t>
+      </w:r>
+      <w:r>
+        <w:rPr>
+          <w:lang w:val="vi-VN"/>
+        </w:rPr>
+        <w:t xml:space="preserve">đáng chú </w:t>
+      </w:r>
+      <w:r>
+        <w:rPr>
+          <w:lang w:val="vi-VN"/>
+        </w:rPr>
+        <w:t>ý</w:t>
+      </w:r>
+    </w:p>
+    <w:p>
+      <w:pPr>
+        <w:pStyle w:val="ListParagraph"/>
+        <w:numPr>
+          <w:ilvl w:val="0"/>
+          <w:numId w:val="1"/>
+        </w:numPr>
+        <w:ind w:firstLine="720"/>
+      </w:pPr>
+      <w:r>
+        <w:t xml:space="preserve">Đề xuất hướng chăm sóc </w:t>
+      </w:r>
+      <w:r>
+        <w:rPr>
+          <w:lang w:val="vi-VN"/>
+        </w:rPr>
+        <w:t>tiếp theo:</w:t>
+      </w:r>
+    </w:p>
+    <w:p>
+      <w:pPr>
+        <w:pStyle w:val="ListParagraph"/>
+        <w:numPr>
+          <w:ilvl w:val="0"/>
+          <w:numId w:val="1"/>
+        </w:numPr>
+        <w:ind w:firstLine="720"/>
+      </w:pPr>
+      <w:r>
+        <w:rPr>
+          <w:lang w:val="vi-VN"/>
+        </w:rPr>
+        <w:t>Buổi gặp tiếp theo: (f</w:t>
+      </w:r>
+      <w:r>
+        <w:rPr>
+          <w:lang w:val="vi-VN"/>
+        </w:rPr>
+        <w:t>ormat thời gian)</w:t>
+      </w:r>
+    </w:p>
+    <w:p>
+      <w:pPr>
+        <w:pStyle w:val="ListParagraph"/>
+        <w:numPr>
+          <w:ilvl w:val="0"/>
+          <w:numId w:val="1"/>
+        </w:numPr>
+        <w:ind w:firstLine="720"/>
+      </w:pPr>
+      <w:r>
+        <w:rPr>
+          <w:lang w:val="vi-VN"/>
+        </w:rPr>
+        <w:t>Nội dung buổi tiếp theo:</w:t>
+      </w:r>
+    </w:p>
+    <w:p>
+      <w:pPr>
+        <w:pStyle w:val="ListParagraph"/>
+        <w:ind w:left="1440"/>
+        <w:rPr>
+          <w:lang w:val="vi-VN"/>
+        </w:rPr>
+      </w:pPr>
     </w:p>
     <w:p>
       <w:pPr>
@@ -1593,7 +1852,6 @@
         <w:rPr>
           <w:lang w:val="vi-VN"/>
         </w:rPr>
-        <w:lastRenderedPageBreak/>
         <w:t>-Sau khi tạo group chat và add bot vào -&gt; Bot nhận diện group chat -&gt; làm theo quy trình Group chat</w:t>
       </w:r>
       <w:r>
@@ -1649,6 +1907,155 @@
 <file path=word/numbering.xml><?xml version="1.0" encoding="utf-8"?>
 <w:numbering xmlns:wpc="http://schemas.microsoft.com/office/word/2010/wordprocessingCanvas" xmlns:cx="http://schemas.microsoft.com/office/drawing/2014/chartex" xmlns:cx1="http://schemas.microsoft.com/office/drawing/2015/9/8/chartex" xmlns:cx2="http://schemas.microsoft.com/office/drawing/2015/10/21/chartex" xmlns:cx3="http://schemas.microsoft.com/office/drawing/2016/5/9/chartex" xmlns:cx4="http://schemas.microsoft.com/office/drawing/2016/5/10/chartex" xmlns:cx5="http://schemas.microsoft.com/office/drawing/2016/5/11/chartex" xmlns:cx6="http://schemas.microsoft.com/office/drawing/2016/5/12/chartex" xmlns:cx7="http://schemas.microsoft.com/office/drawing/2016/5/13/chartex" xmlns:cx8="http://schemas.microsoft.com/office/drawing/2016/5/14/chartex" xmlns:mc="http://schemas.openxmlformats.org/markup-compatibility/2006" xmlns:aink="http://schemas.microsoft.com/office/drawing/2016/ink" xmlns:am3d="http://schemas.microsoft.com/office/drawing/2017/model3d" xmlns:o="urn:schemas-microsoft-com:office:office" xmlns:oel="http://schemas.microsoft.com/office/2019/extlst" xmlns:r="http://schemas.openxmlformats.org/officeDocument/2006/relationships" xmlns:m="http://schemas.openxmlformats.org/officeDocument/2006/math" xmlns:v="urn:schemas-microsoft-com:vml" xmlns:wp14="http://schemas.microsoft.com/office/word/2010/wordprocessingDrawing" xmlns:wp="http://schemas.openxmlformats.org/drawingml/2006/wordprocessingDrawing" xmlns:w10="urn:schemas-microsoft-com:office:word" xmlns:w="http://schemas.openxmlformats.org/wordprocessingml/2006/main" xmlns:w14="http://schemas.microsoft.com/office/word/2010/wordml" xmlns:w15="http://schemas.microsoft.com/office/word/2012/wordml" xmlns:w16cex="http://schemas.microsoft.com/office/word/2018/wordml/cex" xmlns:w16cid="http://schemas.microsoft.com/office/word/2016/wordml/cid" xmlns:w16="http://schemas.microsoft.com/office/word/2018/wordml" xmlns:w16du="http://schemas.microsoft.com/office/word/2023/wordml/word16du" xmlns:w16sdtdh="http://schemas.microsoft.com/office/word/2020/wordml/sdtdatahash" xmlns:w16sdtfl="http://schemas.microsoft.com/office/word/2024/wordml/sdtformatlock" xmlns:w16se="http://schemas.microsoft.com/office/word/2015/wordml/symex" xmlns:wpg="http://schemas.microsoft.com/office/word/2010/wordprocessingGroup" xmlns:wpi="http://schemas.microsoft.com/office/word/2010/wordprocessingInk" xmlns:wne="http://schemas.microsoft.com/office/word/2006/wordml" xmlns:wps="http://schemas.microsoft.com/office/word/2010/wordprocessingShape" mc:Ignorable="w14 w15 w16se w16cid w16 w16cex w16sdtdh w16sdtfl w16du wp14">
   <w:abstractNum w:abstractNumId="0" w15:restartNumberingAfterBreak="0">
+    <w:nsid w:val="0D397A03"/>
+    <w:multiLevelType w:val="multilevel"/>
+    <w:tmpl w:val="2960B5EC"/>
+    <w:lvl w:ilvl="0">
+      <w:start w:val="1"/>
+      <w:numFmt w:val="bullet"/>
+      <w:lvlText w:val=""/>
+      <w:lvlJc w:val="left"/>
+      <w:pPr>
+        <w:tabs>
+          <w:tab w:val="num" w:pos="720"/>
+        </w:tabs>
+        <w:ind w:left="720" w:hanging="360"/>
+      </w:pPr>
+      <w:rPr>
+        <w:rFonts w:ascii="Symbol" w:hAnsi="Symbol" w:hint="default"/>
+        <w:sz w:val="20"/>
+      </w:rPr>
+    </w:lvl>
+    <w:lvl w:ilvl="1" w:tentative="1">
+      <w:start w:val="1"/>
+      <w:numFmt w:val="bullet"/>
+      <w:lvlText w:val="o"/>
+      <w:lvlJc w:val="left"/>
+      <w:pPr>
+        <w:tabs>
+          <w:tab w:val="num" w:pos="1440"/>
+        </w:tabs>
+        <w:ind w:left="1440" w:hanging="360"/>
+      </w:pPr>
+      <w:rPr>
+        <w:rFonts w:ascii="Courier New" w:hAnsi="Courier New" w:hint="default"/>
+        <w:sz w:val="20"/>
+      </w:rPr>
+    </w:lvl>
+    <w:lvl w:ilvl="2" w:tentative="1">
+      <w:start w:val="1"/>
+      <w:numFmt w:val="bullet"/>
+      <w:lvlText w:val=""/>
+      <w:lvlJc w:val="left"/>
+      <w:pPr>
+        <w:tabs>
+          <w:tab w:val="num" w:pos="2160"/>
+        </w:tabs>
+        <w:ind w:left="2160" w:hanging="360"/>
+      </w:pPr>
+      <w:rPr>
+        <w:rFonts w:ascii="Wingdings" w:hAnsi="Wingdings" w:hint="default"/>
+        <w:sz w:val="20"/>
+      </w:rPr>
+    </w:lvl>
+    <w:lvl w:ilvl="3" w:tentative="1">
+      <w:start w:val="1"/>
+      <w:numFmt w:val="bullet"/>
+      <w:lvlText w:val=""/>
+      <w:lvlJc w:val="left"/>
+      <w:pPr>
+        <w:tabs>
+          <w:tab w:val="num" w:pos="2880"/>
+        </w:tabs>
+        <w:ind w:left="2880" w:hanging="360"/>
+      </w:pPr>
+      <w:rPr>
+        <w:rFonts w:ascii="Wingdings" w:hAnsi="Wingdings" w:hint="default"/>
+        <w:sz w:val="20"/>
+      </w:rPr>
+    </w:lvl>
+    <w:lvl w:ilvl="4" w:tentative="1">
+      <w:start w:val="1"/>
+      <w:numFmt w:val="bullet"/>
+      <w:lvlText w:val=""/>
+      <w:lvlJc w:val="left"/>
+      <w:pPr>
+        <w:tabs>
+          <w:tab w:val="num" w:pos="3600"/>
+        </w:tabs>
+        <w:ind w:left="3600" w:hanging="360"/>
+      </w:pPr>
+      <w:rPr>
+        <w:rFonts w:ascii="Wingdings" w:hAnsi="Wingdings" w:hint="default"/>
+        <w:sz w:val="20"/>
+      </w:rPr>
+    </w:lvl>
+    <w:lvl w:ilvl="5" w:tentative="1">
+      <w:start w:val="1"/>
+      <w:numFmt w:val="bullet"/>
+      <w:lvlText w:val=""/>
+      <w:lvlJc w:val="left"/>
+      <w:pPr>
+        <w:tabs>
+          <w:tab w:val="num" w:pos="4320"/>
+        </w:tabs>
+        <w:ind w:left="4320" w:hanging="360"/>
+      </w:pPr>
+      <w:rPr>
+        <w:rFonts w:ascii="Wingdings" w:hAnsi="Wingdings" w:hint="default"/>
+        <w:sz w:val="20"/>
+      </w:rPr>
+    </w:lvl>
+    <w:lvl w:ilvl="6" w:tentative="1">
+      <w:start w:val="1"/>
+      <w:numFmt w:val="bullet"/>
+      <w:lvlText w:val=""/>
+      <w:lvlJc w:val="left"/>
+      <w:pPr>
+        <w:tabs>
+          <w:tab w:val="num" w:pos="5040"/>
+        </w:tabs>
+        <w:ind w:left="5040" w:hanging="360"/>
+      </w:pPr>
+      <w:rPr>
+        <w:rFonts w:ascii="Wingdings" w:hAnsi="Wingdings" w:hint="default"/>
+        <w:sz w:val="20"/>
+      </w:rPr>
+    </w:lvl>
+    <w:lvl w:ilvl="7" w:tentative="1">
+      <w:start w:val="1"/>
+      <w:numFmt w:val="bullet"/>
+      <w:lvlText w:val=""/>
+      <w:lvlJc w:val="left"/>
+      <w:pPr>
+        <w:tabs>
+          <w:tab w:val="num" w:pos="5760"/>
+        </w:tabs>
+        <w:ind w:left="5760" w:hanging="360"/>
+      </w:pPr>
+      <w:rPr>
+        <w:rFonts w:ascii="Wingdings" w:hAnsi="Wingdings" w:hint="default"/>
+        <w:sz w:val="20"/>
+      </w:rPr>
+    </w:lvl>
+    <w:lvl w:ilvl="8" w:tentative="1">
+      <w:start w:val="1"/>
+      <w:numFmt w:val="bullet"/>
+      <w:lvlText w:val=""/>
+      <w:lvlJc w:val="left"/>
+      <w:pPr>
+        <w:tabs>
+          <w:tab w:val="num" w:pos="6480"/>
+        </w:tabs>
+        <w:ind w:left="6480" w:hanging="360"/>
+      </w:pPr>
+      <w:rPr>
+        <w:rFonts w:ascii="Wingdings" w:hAnsi="Wingdings" w:hint="default"/>
+        <w:sz w:val="20"/>
+      </w:rPr>
+    </w:lvl>
+  </w:abstractNum>
+  <w:abstractNum w:abstractNumId="1" w15:restartNumberingAfterBreak="0">
     <w:nsid w:val="3EFF71EF"/>
     <w:multiLevelType w:val="hybridMultilevel"/>
     <w:tmpl w:val="61A08C76"/>
@@ -1663,7 +2070,7 @@
         <w:rFonts w:ascii="Aptos" w:eastAsiaTheme="minorHAnsi" w:hAnsi="Aptos" w:cstheme="minorBidi" w:hint="default"/>
       </w:rPr>
     </w:lvl>
-    <w:lvl w:ilvl="1" w:tplc="04090003" w:tentative="1">
+    <w:lvl w:ilvl="1" w:tplc="04090003">
       <w:start w:val="1"/>
       <w:numFmt w:val="bullet"/>
       <w:lvlText w:val="o"/>
@@ -1760,7 +2167,421 @@
       </w:rPr>
     </w:lvl>
   </w:abstractNum>
+  <w:abstractNum w:abstractNumId="2" w15:restartNumberingAfterBreak="0">
+    <w:nsid w:val="43457A47"/>
+    <w:multiLevelType w:val="multilevel"/>
+    <w:tmpl w:val="89EE04D4"/>
+    <w:lvl w:ilvl="0">
+      <w:start w:val="1"/>
+      <w:numFmt w:val="bullet"/>
+      <w:lvlText w:val=""/>
+      <w:lvlJc w:val="left"/>
+      <w:pPr>
+        <w:tabs>
+          <w:tab w:val="num" w:pos="720"/>
+        </w:tabs>
+        <w:ind w:left="720" w:hanging="360"/>
+      </w:pPr>
+      <w:rPr>
+        <w:rFonts w:ascii="Symbol" w:hAnsi="Symbol" w:hint="default"/>
+        <w:sz w:val="20"/>
+      </w:rPr>
+    </w:lvl>
+    <w:lvl w:ilvl="1" w:tentative="1">
+      <w:start w:val="1"/>
+      <w:numFmt w:val="bullet"/>
+      <w:lvlText w:val="o"/>
+      <w:lvlJc w:val="left"/>
+      <w:pPr>
+        <w:tabs>
+          <w:tab w:val="num" w:pos="1440"/>
+        </w:tabs>
+        <w:ind w:left="1440" w:hanging="360"/>
+      </w:pPr>
+      <w:rPr>
+        <w:rFonts w:ascii="Courier New" w:hAnsi="Courier New" w:hint="default"/>
+        <w:sz w:val="20"/>
+      </w:rPr>
+    </w:lvl>
+    <w:lvl w:ilvl="2" w:tentative="1">
+      <w:start w:val="1"/>
+      <w:numFmt w:val="bullet"/>
+      <w:lvlText w:val=""/>
+      <w:lvlJc w:val="left"/>
+      <w:pPr>
+        <w:tabs>
+          <w:tab w:val="num" w:pos="2160"/>
+        </w:tabs>
+        <w:ind w:left="2160" w:hanging="360"/>
+      </w:pPr>
+      <w:rPr>
+        <w:rFonts w:ascii="Wingdings" w:hAnsi="Wingdings" w:hint="default"/>
+        <w:sz w:val="20"/>
+      </w:rPr>
+    </w:lvl>
+    <w:lvl w:ilvl="3" w:tentative="1">
+      <w:start w:val="1"/>
+      <w:numFmt w:val="bullet"/>
+      <w:lvlText w:val=""/>
+      <w:lvlJc w:val="left"/>
+      <w:pPr>
+        <w:tabs>
+          <w:tab w:val="num" w:pos="2880"/>
+        </w:tabs>
+        <w:ind w:left="2880" w:hanging="360"/>
+      </w:pPr>
+      <w:rPr>
+        <w:rFonts w:ascii="Wingdings" w:hAnsi="Wingdings" w:hint="default"/>
+        <w:sz w:val="20"/>
+      </w:rPr>
+    </w:lvl>
+    <w:lvl w:ilvl="4" w:tentative="1">
+      <w:start w:val="1"/>
+      <w:numFmt w:val="bullet"/>
+      <w:lvlText w:val=""/>
+      <w:lvlJc w:val="left"/>
+      <w:pPr>
+        <w:tabs>
+          <w:tab w:val="num" w:pos="3600"/>
+        </w:tabs>
+        <w:ind w:left="3600" w:hanging="360"/>
+      </w:pPr>
+      <w:rPr>
+        <w:rFonts w:ascii="Wingdings" w:hAnsi="Wingdings" w:hint="default"/>
+        <w:sz w:val="20"/>
+      </w:rPr>
+    </w:lvl>
+    <w:lvl w:ilvl="5" w:tentative="1">
+      <w:start w:val="1"/>
+      <w:numFmt w:val="bullet"/>
+      <w:lvlText w:val=""/>
+      <w:lvlJc w:val="left"/>
+      <w:pPr>
+        <w:tabs>
+          <w:tab w:val="num" w:pos="4320"/>
+        </w:tabs>
+        <w:ind w:left="4320" w:hanging="360"/>
+      </w:pPr>
+      <w:rPr>
+        <w:rFonts w:ascii="Wingdings" w:hAnsi="Wingdings" w:hint="default"/>
+        <w:sz w:val="20"/>
+      </w:rPr>
+    </w:lvl>
+    <w:lvl w:ilvl="6" w:tentative="1">
+      <w:start w:val="1"/>
+      <w:numFmt w:val="bullet"/>
+      <w:lvlText w:val=""/>
+      <w:lvlJc w:val="left"/>
+      <w:pPr>
+        <w:tabs>
+          <w:tab w:val="num" w:pos="5040"/>
+        </w:tabs>
+        <w:ind w:left="5040" w:hanging="360"/>
+      </w:pPr>
+      <w:rPr>
+        <w:rFonts w:ascii="Wingdings" w:hAnsi="Wingdings" w:hint="default"/>
+        <w:sz w:val="20"/>
+      </w:rPr>
+    </w:lvl>
+    <w:lvl w:ilvl="7" w:tentative="1">
+      <w:start w:val="1"/>
+      <w:numFmt w:val="bullet"/>
+      <w:lvlText w:val=""/>
+      <w:lvlJc w:val="left"/>
+      <w:pPr>
+        <w:tabs>
+          <w:tab w:val="num" w:pos="5760"/>
+        </w:tabs>
+        <w:ind w:left="5760" w:hanging="360"/>
+      </w:pPr>
+      <w:rPr>
+        <w:rFonts w:ascii="Wingdings" w:hAnsi="Wingdings" w:hint="default"/>
+        <w:sz w:val="20"/>
+      </w:rPr>
+    </w:lvl>
+    <w:lvl w:ilvl="8" w:tentative="1">
+      <w:start w:val="1"/>
+      <w:numFmt w:val="bullet"/>
+      <w:lvlText w:val=""/>
+      <w:lvlJc w:val="left"/>
+      <w:pPr>
+        <w:tabs>
+          <w:tab w:val="num" w:pos="6480"/>
+        </w:tabs>
+        <w:ind w:left="6480" w:hanging="360"/>
+      </w:pPr>
+      <w:rPr>
+        <w:rFonts w:ascii="Wingdings" w:hAnsi="Wingdings" w:hint="default"/>
+        <w:sz w:val="20"/>
+      </w:rPr>
+    </w:lvl>
+  </w:abstractNum>
+  <w:abstractNum w:abstractNumId="3" w15:restartNumberingAfterBreak="0">
+    <w:nsid w:val="63E34584"/>
+    <w:multiLevelType w:val="multilevel"/>
+    <w:tmpl w:val="258A9C6C"/>
+    <w:lvl w:ilvl="0">
+      <w:start w:val="1"/>
+      <w:numFmt w:val="decimal"/>
+      <w:lvlText w:val="%1."/>
+      <w:lvlJc w:val="left"/>
+      <w:pPr>
+        <w:tabs>
+          <w:tab w:val="num" w:pos="720"/>
+        </w:tabs>
+        <w:ind w:left="720" w:hanging="360"/>
+      </w:pPr>
+    </w:lvl>
+    <w:lvl w:ilvl="1" w:tentative="1">
+      <w:start w:val="1"/>
+      <w:numFmt w:val="decimal"/>
+      <w:lvlText w:val="%2."/>
+      <w:lvlJc w:val="left"/>
+      <w:pPr>
+        <w:tabs>
+          <w:tab w:val="num" w:pos="1440"/>
+        </w:tabs>
+        <w:ind w:left="1440" w:hanging="360"/>
+      </w:pPr>
+    </w:lvl>
+    <w:lvl w:ilvl="2" w:tentative="1">
+      <w:start w:val="1"/>
+      <w:numFmt w:val="decimal"/>
+      <w:lvlText w:val="%3."/>
+      <w:lvlJc w:val="left"/>
+      <w:pPr>
+        <w:tabs>
+          <w:tab w:val="num" w:pos="2160"/>
+        </w:tabs>
+        <w:ind w:left="2160" w:hanging="360"/>
+      </w:pPr>
+    </w:lvl>
+    <w:lvl w:ilvl="3" w:tentative="1">
+      <w:start w:val="1"/>
+      <w:numFmt w:val="decimal"/>
+      <w:lvlText w:val="%4."/>
+      <w:lvlJc w:val="left"/>
+      <w:pPr>
+        <w:tabs>
+          <w:tab w:val="num" w:pos="2880"/>
+        </w:tabs>
+        <w:ind w:left="2880" w:hanging="360"/>
+      </w:pPr>
+    </w:lvl>
+    <w:lvl w:ilvl="4" w:tentative="1">
+      <w:start w:val="1"/>
+      <w:numFmt w:val="decimal"/>
+      <w:lvlText w:val="%5."/>
+      <w:lvlJc w:val="left"/>
+      <w:pPr>
+        <w:tabs>
+          <w:tab w:val="num" w:pos="3600"/>
+        </w:tabs>
+        <w:ind w:left="3600" w:hanging="360"/>
+      </w:pPr>
+    </w:lvl>
+    <w:lvl w:ilvl="5" w:tentative="1">
+      <w:start w:val="1"/>
+      <w:numFmt w:val="decimal"/>
+      <w:lvlText w:val="%6."/>
+      <w:lvlJc w:val="left"/>
+      <w:pPr>
+        <w:tabs>
+          <w:tab w:val="num" w:pos="4320"/>
+        </w:tabs>
+        <w:ind w:left="4320" w:hanging="360"/>
+      </w:pPr>
+    </w:lvl>
+    <w:lvl w:ilvl="6" w:tentative="1">
+      <w:start w:val="1"/>
+      <w:numFmt w:val="decimal"/>
+      <w:lvlText w:val="%7."/>
+      <w:lvlJc w:val="left"/>
+      <w:pPr>
+        <w:tabs>
+          <w:tab w:val="num" w:pos="5040"/>
+        </w:tabs>
+        <w:ind w:left="5040" w:hanging="360"/>
+      </w:pPr>
+    </w:lvl>
+    <w:lvl w:ilvl="7" w:tentative="1">
+      <w:start w:val="1"/>
+      <w:numFmt w:val="decimal"/>
+      <w:lvlText w:val="%8."/>
+      <w:lvlJc w:val="left"/>
+      <w:pPr>
+        <w:tabs>
+          <w:tab w:val="num" w:pos="5760"/>
+        </w:tabs>
+        <w:ind w:left="5760" w:hanging="360"/>
+      </w:pPr>
+    </w:lvl>
+    <w:lvl w:ilvl="8" w:tentative="1">
+      <w:start w:val="1"/>
+      <w:numFmt w:val="decimal"/>
+      <w:lvlText w:val="%9."/>
+      <w:lvlJc w:val="left"/>
+      <w:pPr>
+        <w:tabs>
+          <w:tab w:val="num" w:pos="6480"/>
+        </w:tabs>
+        <w:ind w:left="6480" w:hanging="360"/>
+      </w:pPr>
+    </w:lvl>
+  </w:abstractNum>
+  <w:abstractNum w:abstractNumId="4" w15:restartNumberingAfterBreak="0">
+    <w:nsid w:val="68D9232C"/>
+    <w:multiLevelType w:val="multilevel"/>
+    <w:tmpl w:val="F7204638"/>
+    <w:lvl w:ilvl="0">
+      <w:start w:val="5"/>
+      <w:numFmt w:val="decimal"/>
+      <w:lvlText w:val="%1."/>
+      <w:lvlJc w:val="left"/>
+      <w:pPr>
+        <w:tabs>
+          <w:tab w:val="num" w:pos="720"/>
+        </w:tabs>
+        <w:ind w:left="720" w:hanging="360"/>
+      </w:pPr>
+    </w:lvl>
+    <w:lvl w:ilvl="1" w:tentative="1">
+      <w:start w:val="1"/>
+      <w:numFmt w:val="decimal"/>
+      <w:lvlText w:val="%2."/>
+      <w:lvlJc w:val="left"/>
+      <w:pPr>
+        <w:tabs>
+          <w:tab w:val="num" w:pos="1440"/>
+        </w:tabs>
+        <w:ind w:left="1440" w:hanging="360"/>
+      </w:pPr>
+    </w:lvl>
+    <w:lvl w:ilvl="2" w:tentative="1">
+      <w:start w:val="1"/>
+      <w:numFmt w:val="decimal"/>
+      <w:lvlText w:val="%3."/>
+      <w:lvlJc w:val="left"/>
+      <w:pPr>
+        <w:tabs>
+          <w:tab w:val="num" w:pos="2160"/>
+        </w:tabs>
+        <w:ind w:left="2160" w:hanging="360"/>
+      </w:pPr>
+    </w:lvl>
+    <w:lvl w:ilvl="3" w:tentative="1">
+      <w:start w:val="1"/>
+      <w:numFmt w:val="decimal"/>
+      <w:lvlText w:val="%4."/>
+      <w:lvlJc w:val="left"/>
+      <w:pPr>
+        <w:tabs>
+          <w:tab w:val="num" w:pos="2880"/>
+        </w:tabs>
+        <w:ind w:left="2880" w:hanging="360"/>
+      </w:pPr>
+    </w:lvl>
+    <w:lvl w:ilvl="4" w:tentative="1">
+      <w:start w:val="1"/>
+      <w:numFmt w:val="decimal"/>
+      <w:lvlText w:val="%5."/>
+      <w:lvlJc w:val="left"/>
+      <w:pPr>
+        <w:tabs>
+          <w:tab w:val="num" w:pos="3600"/>
+        </w:tabs>
+        <w:ind w:left="3600" w:hanging="360"/>
+      </w:pPr>
+    </w:lvl>
+    <w:lvl w:ilvl="5" w:tentative="1">
+      <w:start w:val="1"/>
+      <w:numFmt w:val="decimal"/>
+      <w:lvlText w:val="%6."/>
+      <w:lvlJc w:val="left"/>
+      <w:pPr>
+        <w:tabs>
+          <w:tab w:val="num" w:pos="4320"/>
+        </w:tabs>
+        <w:ind w:left="4320" w:hanging="360"/>
+      </w:pPr>
+    </w:lvl>
+    <w:lvl w:ilvl="6" w:tentative="1">
+      <w:start w:val="1"/>
+      <w:numFmt w:val="decimal"/>
+      <w:lvlText w:val="%7."/>
+      <w:lvlJc w:val="left"/>
+      <w:pPr>
+        <w:tabs>
+          <w:tab w:val="num" w:pos="5040"/>
+        </w:tabs>
+        <w:ind w:left="5040" w:hanging="360"/>
+      </w:pPr>
+    </w:lvl>
+    <w:lvl w:ilvl="7" w:tentative="1">
+      <w:start w:val="1"/>
+      <w:numFmt w:val="decimal"/>
+      <w:lvlText w:val="%8."/>
+      <w:lvlJc w:val="left"/>
+      <w:pPr>
+        <w:tabs>
+          <w:tab w:val="num" w:pos="5760"/>
+        </w:tabs>
+        <w:ind w:left="5760" w:hanging="360"/>
+      </w:pPr>
+    </w:lvl>
+    <w:lvl w:ilvl="8" w:tentative="1">
+      <w:start w:val="1"/>
+      <w:numFmt w:val="decimal"/>
+      <w:lvlText w:val="%9."/>
+      <w:lvlJc w:val="left"/>
+      <w:pPr>
+        <w:tabs>
+          <w:tab w:val="num" w:pos="6480"/>
+        </w:tabs>
+        <w:ind w:left="6480" w:hanging="360"/>
+      </w:pPr>
+    </w:lvl>
+  </w:abstractNum>
   <w:num w:numId="1" w16cid:durableId="1869030363">
+    <w:abstractNumId w:val="1"/>
+  </w:num>
+  <w:num w:numId="2" w16cid:durableId="835462412">
+    <w:abstractNumId w:val="3"/>
+  </w:num>
+  <w:num w:numId="3" w16cid:durableId="664748440">
+    <w:abstractNumId w:val="4"/>
+    <w:lvlOverride w:ilvl="0">
+      <w:lvl w:ilvl="0">
+        <w:numFmt w:val="decimal"/>
+        <w:lvlText w:val="%1."/>
+        <w:lvlJc w:val="left"/>
+      </w:lvl>
+    </w:lvlOverride>
+  </w:num>
+  <w:num w:numId="4" w16cid:durableId="1474326975">
+    <w:abstractNumId w:val="4"/>
+    <w:lvlOverride w:ilvl="0">
+      <w:lvl w:ilvl="0">
+        <w:numFmt w:val="decimal"/>
+        <w:lvlText w:val="%1."/>
+        <w:lvlJc w:val="left"/>
+      </w:lvl>
+    </w:lvlOverride>
+  </w:num>
+  <w:num w:numId="5" w16cid:durableId="1265990756">
+    <w:abstractNumId w:val="4"/>
+    <w:lvlOverride w:ilvl="0">
+      <w:lvl w:ilvl="0">
+        <w:numFmt w:val="decimal"/>
+        <w:lvlText w:val="%1."/>
+        <w:lvlJc w:val="left"/>
+      </w:lvl>
+    </w:lvlOverride>
+  </w:num>
+  <w:num w:numId="6" w16cid:durableId="1102409615">
+    <w:abstractNumId w:val="2"/>
+  </w:num>
+  <w:num w:numId="7" w16cid:durableId="1767191493">
     <w:abstractNumId w:val="0"/>
   </w:num>
 </w:numbering>
@@ -2369,7 +3190,6 @@
   <w:style w:type="character" w:default="1" w:styleId="DefaultParagraphFont">
     <w:name w:val="Default Paragraph Font"/>
     <w:uiPriority w:val="1"/>
-    <w:semiHidden/>
     <w:unhideWhenUsed/>
   </w:style>
   <w:style w:type="table" w:default="1" w:styleId="TableNormal">
@@ -2720,6 +3540,17 @@
         <w:insideV w:val="single" w:sz="4" w:space="0" w:color="auto"/>
       </w:tblBorders>
     </w:tblPr>
+  </w:style>
+  <w:style w:type="paragraph" w:styleId="NormalWeb">
+    <w:name w:val="Normal (Web)"/>
+    <w:basedOn w:val="Normal"/>
+    <w:uiPriority w:val="99"/>
+    <w:semiHidden/>
+    <w:unhideWhenUsed/>
+    <w:rsid w:val="009246C2"/>
+    <w:rPr>
+      <w:rFonts w:ascii="Times New Roman" w:hAnsi="Times New Roman" w:cs="Times New Roman"/>
+    </w:rPr>
   </w:style>
 </w:styles>
 </file>

</xml_diff>

<commit_message>
fix: sort timeline events explicitly by descending creation date & fix highlight marker
</commit_message>
<xml_diff>
--- a/mong muốn 1.docx
+++ b/mong muốn 1.docx
@@ -1844,9 +1844,6 @@
     <w:p>
       <w:pPr>
         <w:pStyle w:val="ListParagraph"/>
-        <w:rPr>
-          <w:lang w:val="vi-VN"/>
-        </w:rPr>
       </w:pPr>
       <w:r>
         <w:rPr>
@@ -1893,6 +1890,292 @@
         </w:rPr>
         <w:br/>
       </w:r>
+    </w:p>
+    <w:p>
+      <w:pPr>
+        <w:pStyle w:val="ListParagraph"/>
+      </w:pPr>
+      <w:r>
+        <w:rPr>
+          <w:rFonts w:ascii="Segoe UI Emoji" w:hAnsi="Segoe UI Emoji" w:cs="Segoe UI Emoji"/>
+        </w:rPr>
+        <w:t>📅</w:t>
+      </w:r>
+    </w:p>
+    <w:p>
+      <w:pPr>
+        <w:pStyle w:val="ListParagraph"/>
+        <w:rPr>
+          <w:b/>
+          <w:bCs/>
+        </w:rPr>
+      </w:pPr>
+      <w:r>
+        <w:rPr>
+          <w:b/>
+          <w:bCs/>
+        </w:rPr>
+        <w:t>Chốt TV lần 1 (ennea)</w:t>
+      </w:r>
+    </w:p>
+    <w:p>
+      <w:pPr>
+        <w:pStyle w:val="ListParagraph"/>
+      </w:pPr>
+      <w:r>
+        <w:t>15/3/2026</w:t>
+      </w:r>
+    </w:p>
+    <w:p>
+      <w:pPr>
+        <w:pStyle w:val="ListParagraph"/>
+      </w:pPr>
+      <w:r>
+        <w:rPr>
+          <w:rFonts w:ascii="Segoe UI Emoji" w:hAnsi="Segoe UI Emoji" w:cs="Segoe UI Emoji"/>
+        </w:rPr>
+        <w:t>📝</w:t>
+      </w:r>
+    </w:p>
+    <w:p>
+      <w:pPr>
+        <w:pStyle w:val="ListParagraph"/>
+        <w:rPr>
+          <w:b/>
+          <w:bCs/>
+        </w:rPr>
+      </w:pPr>
+      <w:r>
+        <w:rPr>
+          <w:b/>
+          <w:bCs/>
+        </w:rPr>
+        <w:t>Báo cáo TV lần 1</w:t>
+      </w:r>
+    </w:p>
+    <w:p>
+      <w:pPr>
+        <w:pStyle w:val="ListParagraph"/>
+      </w:pPr>
+      <w:r>
+        <w:t>15/3/2026</w:t>
+      </w:r>
+    </w:p>
+    <w:p>
+      <w:pPr>
+        <w:pStyle w:val="ListParagraph"/>
+      </w:pPr>
+      <w:r>
+        <w:rPr>
+          <w:rFonts w:ascii="Segoe UI Emoji" w:hAnsi="Segoe UI Emoji" w:cs="Segoe UI Emoji"/>
+        </w:rPr>
+        <w:t>📅</w:t>
+      </w:r>
+    </w:p>
+    <w:p>
+      <w:pPr>
+        <w:pStyle w:val="ListParagraph"/>
+        <w:rPr>
+          <w:b/>
+          <w:bCs/>
+        </w:rPr>
+      </w:pPr>
+      <w:r>
+        <w:rPr>
+          <w:b/>
+          <w:bCs/>
+        </w:rPr>
+        <w:t>Chốt TV lần 2 (cô gái dưới mưa)</w:t>
+      </w:r>
+    </w:p>
+    <w:p>
+      <w:pPr>
+        <w:pStyle w:val="ListParagraph"/>
+      </w:pPr>
+      <w:r>
+        <w:t>15/3/2026</w:t>
+      </w:r>
+    </w:p>
+    <w:p>
+      <w:pPr>
+        <w:pStyle w:val="ListParagraph"/>
+      </w:pPr>
+      <w:r>
+        <w:rPr>
+          <w:rFonts w:ascii="Segoe UI Emoji" w:hAnsi="Segoe UI Emoji" w:cs="Segoe UI Emoji"/>
+        </w:rPr>
+        <w:t>📝</w:t>
+      </w:r>
+    </w:p>
+    <w:p>
+      <w:pPr>
+        <w:pStyle w:val="ListParagraph"/>
+        <w:rPr>
+          <w:b/>
+          <w:bCs/>
+        </w:rPr>
+      </w:pPr>
+      <w:r>
+        <w:rPr>
+          <w:b/>
+          <w:bCs/>
+        </w:rPr>
+        <w:t>Báo cáo TV lần 2</w:t>
+      </w:r>
+    </w:p>
+    <w:p>
+      <w:pPr>
+        <w:pStyle w:val="ListParagraph"/>
+      </w:pPr>
+      <w:r>
+        <w:t>15/3/2026</w:t>
+      </w:r>
+    </w:p>
+    <w:p>
+      <w:pPr>
+        <w:pStyle w:val="ListParagraph"/>
+      </w:pPr>
+      <w:r>
+        <w:rPr>
+          <w:rFonts w:ascii="Segoe UI Emoji" w:hAnsi="Segoe UI Emoji" w:cs="Segoe UI Emoji"/>
+        </w:rPr>
+        <w:t>🎓</w:t>
+      </w:r>
+    </w:p>
+    <w:p>
+      <w:pPr>
+        <w:pStyle w:val="ListParagraph"/>
+        <w:rPr>
+          <w:b/>
+          <w:bCs/>
+        </w:rPr>
+      </w:pPr>
+      <w:r>
+        <w:rPr>
+          <w:b/>
+          <w:bCs/>
+        </w:rPr>
+        <w:lastRenderedPageBreak/>
+        <w:t>Chốt BB</w:t>
+      </w:r>
+    </w:p>
+    <w:p>
+      <w:pPr>
+        <w:pStyle w:val="ListParagraph"/>
+      </w:pPr>
+      <w:r>
+        <w:t>15/3/2026</w:t>
+      </w:r>
+    </w:p>
+    <w:p>
+      <w:pPr>
+        <w:pStyle w:val="ListParagraph"/>
+      </w:pPr>
+      <w:r>
+        <w:rPr>
+          <w:rFonts w:ascii="Segoe UI Emoji" w:hAnsi="Segoe UI Emoji" w:cs="Segoe UI Emoji"/>
+        </w:rPr>
+        <w:t>📋</w:t>
+      </w:r>
+    </w:p>
+    <w:p>
+      <w:pPr>
+        <w:pStyle w:val="ListParagraph"/>
+        <w:rPr>
+          <w:b/>
+          <w:bCs/>
+        </w:rPr>
+      </w:pPr>
+      <w:r>
+        <w:rPr>
+          <w:b/>
+          <w:bCs/>
+        </w:rPr>
+        <w:t>Báo cáo BB buổi 1</w:t>
+      </w:r>
+    </w:p>
+    <w:p>
+      <w:pPr>
+        <w:pStyle w:val="ListParagraph"/>
+      </w:pPr>
+      <w:r>
+        <w:t>15/3/2026</w:t>
+      </w:r>
+    </w:p>
+    <w:p>
+      <w:pPr>
+        <w:pStyle w:val="ListParagraph"/>
+      </w:pPr>
+      <w:r>
+        <w:rPr>
+          <w:rFonts w:ascii="Segoe UI Emoji" w:hAnsi="Segoe UI Emoji" w:cs="Segoe UI Emoji"/>
+        </w:rPr>
+        <w:t>🏛️</w:t>
+      </w:r>
+    </w:p>
+    <w:p>
+      <w:pPr>
+        <w:pStyle w:val="ListParagraph"/>
+        <w:rPr>
+          <w:b/>
+          <w:bCs/>
+        </w:rPr>
+      </w:pPr>
+      <w:r>
+        <w:rPr>
+          <w:b/>
+          <w:bCs/>
+        </w:rPr>
+        <w:t>Chốt Center</w:t>
+      </w:r>
+    </w:p>
+    <w:p>
+      <w:pPr>
+        <w:pStyle w:val="ListParagraph"/>
+      </w:pPr>
+      <w:r>
+        <w:t>15/3/2026</w:t>
+      </w:r>
+    </w:p>
+    <w:p>
+      <w:pPr>
+        <w:pStyle w:val="ListParagraph"/>
+      </w:pPr>
+      <w:r>
+        <w:rPr>
+          <w:rFonts w:ascii="Segoe UI Emoji" w:hAnsi="Segoe UI Emoji" w:cs="Segoe UI Emoji"/>
+        </w:rPr>
+        <w:t>🍎</w:t>
+      </w:r>
+    </w:p>
+    <w:p>
+      <w:pPr>
+        <w:pStyle w:val="ListParagraph"/>
+        <w:rPr>
+          <w:b/>
+          <w:bCs/>
+        </w:rPr>
+      </w:pPr>
+      <w:r>
+        <w:rPr>
+          <w:b/>
+          <w:bCs/>
+        </w:rPr>
+        <w:t>Ngày Chakki (Hapja)</w:t>
+      </w:r>
+    </w:p>
+    <w:p>
+      <w:pPr>
+        <w:pStyle w:val="ListParagraph"/>
+      </w:pPr>
+      <w:r>
+        <w:t>16/3/2026</w:t>
+      </w:r>
+    </w:p>
+    <w:p>
+      <w:pPr>
+        <w:pStyle w:val="ListParagraph"/>
+      </w:pPr>
     </w:p>
     <w:sectPr>
       <w:pgSz w:w="12240" w:h="15840"/>

</xml_diff>